<commit_message>
neat run all plots port consitiuents
</commit_message>
<xml_diff>
--- a/Plan.docx
+++ b/Plan.docx
@@ -92,16 +92,7 @@
           <w:rFonts w:hint="default"/>
           <w:lang w:val="en-GB"/>
         </w:rPr>
-        <w:t>Industry</w:t>
-      </w:r>
-      <w:bookmarkStart w:id="0" w:name="_GoBack"/>
-      <w:bookmarkEnd w:id="0"/>
-      <w:r>
-        <w:rPr>
-          <w:rFonts w:hint="default"/>
-          <w:lang w:val="en-GB"/>
-        </w:rPr>
-        <w:t>: All</w:t>
+        <w:t>Industry: All</w:t>
       </w:r>
     </w:p>
     <w:p>
@@ -303,8 +294,10 @@
           <w:rFonts w:hint="default"/>
           <w:lang w:val="en-GB"/>
         </w:rPr>
-        <w:t>Table - Sharpe, Alpha, P-Value, Max DD</w:t>
-      </w:r>
+        <w:t>Cum Table</w:t>
+      </w:r>
+      <w:bookmarkStart w:id="0" w:name="_GoBack"/>
+      <w:bookmarkEnd w:id="0"/>
     </w:p>
     <w:p>
       <w:pPr>
@@ -322,7 +315,7 @@
           <w:rFonts w:hint="default"/>
           <w:lang w:val="en-GB"/>
         </w:rPr>
-        <w:t>Rolling Sharpe (T, Sector, Average) - 40 months</w:t>
+        <w:t>Table - Sharpe, Alpha, P-Value, Max DD</w:t>
       </w:r>
     </w:p>
     <w:p>
@@ -341,7 +334,7 @@
           <w:rFonts w:hint="default"/>
           <w:lang w:val="en-GB"/>
         </w:rPr>
-        <w:t>Rolling Alpha - 40 Months</w:t>
+        <w:t>Rolling Sharpe (T, Sector, Average) - 40 months</w:t>
       </w:r>
     </w:p>
     <w:p>
@@ -360,7 +353,26 @@
           <w:rFonts w:hint="default"/>
           <w:lang w:val="en-GB"/>
         </w:rPr>
-        <w:t>Folder : Portfolio Constituents</w:t>
+        <w:t>Rolling Alpha - 40 Months</w:t>
+      </w:r>
+    </w:p>
+    <w:p>
+      <w:pPr>
+        <w:numPr>
+          <w:ilvl w:val="0"/>
+          <w:numId w:val="1"/>
+        </w:numPr>
+        <w:rPr>
+          <w:rFonts w:hint="default"/>
+          <w:lang w:val="en-GB"/>
+        </w:rPr>
+      </w:pPr>
+      <w:r>
+        <w:rPr>
+          <w:rFonts w:hint="default"/>
+          <w:lang w:val="en-GB"/>
+        </w:rPr>
+        <w:t>Folder : Portfolio Constituents (Uvariate Split)</w:t>
       </w:r>
     </w:p>
     <w:p>

</xml_diff>

<commit_message>
functionising rolling alpha plots
</commit_message>
<xml_diff>
--- a/Plan.docx
+++ b/Plan.docx
@@ -296,8 +296,6 @@
         </w:rPr>
         <w:t>Cum Table</w:t>
       </w:r>
-      <w:bookmarkStart w:id="0" w:name="_GoBack"/>
-      <w:bookmarkEnd w:id="0"/>
     </w:p>
     <w:p>
       <w:pPr>
@@ -431,6 +429,50 @@
         </w:rPr>
         <w:t>Loc_Final</w:t>
       </w:r>
+    </w:p>
+    <w:p>
+      <w:pPr>
+        <w:numPr>
+          <w:numId w:val="0"/>
+        </w:numPr>
+        <w:ind w:firstLine="720" w:firstLineChars="0"/>
+        <w:rPr>
+          <w:rFonts w:hint="default"/>
+          <w:lang w:val="en-GB"/>
+        </w:rPr>
+      </w:pPr>
+    </w:p>
+    <w:p>
+      <w:pPr>
+        <w:numPr>
+          <w:numId w:val="0"/>
+        </w:numPr>
+        <w:ind w:firstLine="720" w:firstLineChars="0"/>
+        <w:rPr>
+          <w:rFonts w:hint="default"/>
+          <w:lang w:val="en-GB"/>
+        </w:rPr>
+      </w:pPr>
+    </w:p>
+    <w:p>
+      <w:pPr>
+        <w:numPr>
+          <w:numId w:val="0"/>
+        </w:numPr>
+        <w:rPr>
+          <w:rFonts w:hint="default"/>
+          <w:lang w:val="en-GB"/>
+        </w:rPr>
+      </w:pPr>
+      <w:r>
+        <w:rPr>
+          <w:rFonts w:hint="default"/>
+          <w:lang w:val="en-GB"/>
+        </w:rPr>
+        <w:t>Define suffix to save in a variable</w:t>
+      </w:r>
+      <w:bookmarkStart w:id="0" w:name="_GoBack"/>
+      <w:bookmarkEnd w:id="0"/>
     </w:p>
     <w:p>
       <w:pPr>

</xml_diff>